<commit_message>
Update Week 2 handout: replace stop-and-edit tip with new-topic-new-chat tip
Co-Authored-By: Claude Fable 5.1 <noreply@anthropic.com>
Claude-Session: https://claude.ai/code/session_01UNPTaoeu43jkAWZtGdbv5H
</commit_message>
<xml_diff>
--- a/materials/files/Week2_Handout_Confidentiality_and_Advanced_Prompting.docx
+++ b/materials/files/Week2_Handout_Confidentiality_and_Advanced_Prompting.docx
@@ -1696,7 +1696,7 @@
                 <w:sz w:val="22"/>
                 <w:szCs w:val="22"/>
               </w:rPr>
-              <w:t xml:space="preserve">Stop and edit when you send too soon.</w:t>
+              <w:t xml:space="preserve">New topic: new chat.</w:t>
             </w:r>
           </w:p>
           <w:p>
@@ -1709,7 +1709,7 @@
                 <w:sz w:val="20"/>
                 <w:szCs w:val="20"/>
               </w:rPr>
-              <w:t xml:space="preserve">Click Stop, hover over your message, click the pencil (Edit), finish the prompt, and resubmit. A finished prompt saves tokens, because the platform re-reads the whole chat with every message.</w:t>
+              <w:t xml:space="preserve">When you start a new topic, begin with a new chat. It keeps things organized and avoids having the AI read irrelevant information, thereby confusing it and burning tokens.</w:t>
             </w:r>
           </w:p>
         </w:tc>

</xml_diff>